<commit_message>
Records go out as one dated zip (scripts/package.sh); rule written into CLAUDE.md and Operating Rules
Co-Authored-By: Claude Opus 5.5 <noreply@anthropic.com>
Claude-Session: https://claude.ai/code/session_01JPZJaTbXQFN2qiYRf4rkZK
</commit_message>
<xml_diff>
--- a/docs/Next_Owner_Market_Beat_The_Competition.docx
+++ b/docs/Next_Owner_Market_Beat_The_Competition.docx
@@ -171,25 +171,7 @@
         <w:pStyle w:val="Compact"/>
       </w:pPr>
       <w:r>
-        <w:t xml:space="preserve">trial tricks, like getting charged during a</w:t>
-      </w:r>
-      <w:r>
-        <w:t xml:space="preserve"> </w:t>
-      </w:r>
-      <w:r>
-        <w:t xml:space="preserve">“</w:t>
-      </w:r>
-      <w:r>
-        <w:t xml:space="preserve">free trial</w:t>
-      </w:r>
-      <w:r>
-        <w:t xml:space="preserve">”</w:t>
-      </w:r>
-      <w:r>
-        <w:t xml:space="preserve"> </w:t>
-      </w:r>
-      <w:r>
-        <w:t xml:space="preserve">or after cancelling.</w:t>
+        <w:t xml:space="preserve">trial tricks, like getting charged during a "free trial" or after cancelling.</w:t>
       </w:r>
     </w:p>
     <w:p>
@@ -207,25 +189,7 @@
         <w:t xml:space="preserve"> </w:t>
       </w:r>
       <w:r>
-        <w:t xml:space="preserve">That lets us give the scan away. Each free answer brings in a shopper, and each</w:t>
-      </w:r>
-      <w:r>
-        <w:t xml:space="preserve"> </w:t>
-      </w:r>
-      <w:r>
-        <w:t xml:space="preserve">“</w:t>
-      </w:r>
-      <w:r>
-        <w:t xml:space="preserve">I bought it</w:t>
-      </w:r>
-      <w:r>
-        <w:t xml:space="preserve">”</w:t>
-      </w:r>
-      <w:r>
-        <w:t xml:space="preserve"> </w:t>
-      </w:r>
-      <w:r>
-        <w:t xml:space="preserve">becomes a listing we earn on.</w:t>
+        <w:t xml:space="preserve">That lets us give the scan away. Each free answer brings in a shopper, and each "I bought it" becomes a listing we earn on.</w:t>
       </w:r>
     </w:p>
     <w:bookmarkEnd w:id="20"/>
@@ -235,25 +199,7 @@
         <w:pStyle w:val="Heading1"/>
       </w:pPr>
       <w:r>
-        <w:t xml:space="preserve">What</w:t>
-      </w:r>
-      <w:r>
-        <w:t xml:space="preserve"> </w:t>
-      </w:r>
-      <w:r>
-        <w:t xml:space="preserve">“</w:t>
-      </w:r>
-      <w:r>
-        <w:t xml:space="preserve">Paid $4, sells for $45, $31 profit</w:t>
-      </w:r>
-      <w:r>
-        <w:t xml:space="preserve">”</w:t>
-      </w:r>
-      <w:r>
-        <w:t xml:space="preserve"> </w:t>
-      </w:r>
-      <w:r>
-        <w:t xml:space="preserve">means</w:t>
+        <w:t xml:space="preserve">What "Paid $4, sells for $45, $31 profit" means</w:t>
       </w:r>
     </w:p>
     <w:p>
@@ -261,7 +207,7 @@
         <w:pStyle w:val="FirstParagraph"/>
       </w:pPr>
       <w:r>
-        <w:t xml:space="preserve">You’re at Goodwill holding a lamp with a</w:t>
+        <w:t xml:space="preserve">You're at Goodwill holding a lamp with a</w:t>
       </w:r>
       <w:r>
         <w:t xml:space="preserve"> </w:t>
@@ -293,7 +239,7 @@
         <w:t xml:space="preserve"> </w:t>
       </w:r>
       <w:r>
-        <w:t xml:space="preserve">used. After the selling site’s fees and shipping, you’d keep about</w:t>
+        <w:t xml:space="preserve">used. After the selling site's fees and shipping, you'd keep about</w:t>
       </w:r>
       <w:r>
         <w:t xml:space="preserve"> </w:t>
@@ -306,7 +252,7 @@
         <w:t xml:space="preserve">$31</w:t>
       </w:r>
       <w:r>
-        <w:t xml:space="preserve">. That’s a BUY.</w:t>
+        <w:t xml:space="preserve">. That's a BUY.</w:t>
       </w:r>
     </w:p>
     <w:p>
@@ -346,7 +292,7 @@
     <w:tbl>
       <w:tblPr>
         <w:tblStyle w:val="Table"/>
-        <w:tblW w:type="pct" w:w="5000"/>
+        <w:tblW w:type="auto" w:w="0"/>
         <w:tblLook w:firstRow="1" w:lastRow="0" w:firstColumn="0" w:lastColumn="0" w:noHBand="0" w:noVBand="0" w:val="0020"/>
         <w:jc w:val="start"/>
       </w:tblPr>
@@ -523,25 +469,7 @@
               <w:jc w:val="left"/>
             </w:pPr>
             <w:r>
-              <w:t xml:space="preserve">People praise</w:t>
-            </w:r>
-            <w:r>
-              <w:t xml:space="preserve"> </w:t>
-            </w:r>
-            <w:r>
-              <w:t xml:space="preserve">“</w:t>
-            </w:r>
-            <w:r>
-              <w:t xml:space="preserve">net after fees</w:t>
-            </w:r>
-            <w:r>
-              <w:t xml:space="preserve">”</w:t>
-            </w:r>
-            <w:r>
-              <w:t xml:space="preserve"> </w:t>
-            </w:r>
-            <w:r>
-              <w:t xml:space="preserve">in reviews</w:t>
+              <w:t xml:space="preserve">People praise "net after fees" in reviews</w:t>
             </w:r>
           </w:p>
         </w:tc>
@@ -577,25 +505,7 @@
               <w:t xml:space="preserve"> </w:t>
             </w:r>
             <w:r>
-              <w:t xml:space="preserve">“</w:t>
-            </w:r>
-            <w:r>
-              <w:t xml:space="preserve">Leave it and you miss $31,</w:t>
-            </w:r>
-            <w:r>
-              <w:t xml:space="preserve">”</w:t>
-            </w:r>
-            <w:r>
-              <w:t xml:space="preserve"> </w:t>
-            </w:r>
-            <w:r>
-              <w:t xml:space="preserve">“</w:t>
-            </w:r>
-            <w:r>
-              <w:t xml:space="preserve">Buy it and you’d lose $4</w:t>
-            </w:r>
-            <w:r>
-              <w:t xml:space="preserve">”</w:t>
+              <w:t xml:space="preserve">"Leave it and you miss $31," "Buy it and you'd lose $4"</w:t>
             </w:r>
           </w:p>
         </w:tc>
@@ -637,83 +547,55 @@
                 <w:bCs/>
                 <w:b/>
               </w:rPr>
-              <w:t xml:space="preserve">“</w:t>
-            </w:r>
+              <w:t xml:space="preserve">"Worth it at $X or less"</w:t>
+            </w:r>
+            <w:r>
+              <w:t xml:space="preserve"> </w:t>
+            </w:r>
+            <w:r>
+              <w:t xml:space="preserve">on a MAYBE</w:t>
+            </w:r>
+          </w:p>
+        </w:tc>
+        <w:tc>
+          <w:tcPr/>
+          <w:p>
+            <w:pPr>
+              <w:pStyle w:val="Compact"/>
+              <w:jc w:val="left"/>
+            </w:pPr>
+            <w:r>
+              <w:t xml:space="preserve">Gives a next step at the register</w:t>
+            </w:r>
+          </w:p>
+        </w:tc>
+        <w:tc>
+          <w:tcPr/>
+          <w:p>
+            <w:pPr>
+              <w:pStyle w:val="Compact"/>
+              <w:jc w:val="left"/>
+            </w:pPr>
+            <w:r>
+              <w:t xml:space="preserve">New</w:t>
+            </w:r>
+          </w:p>
+        </w:tc>
+      </w:tr>
+      <w:tr>
+        <w:tc>
+          <w:tcPr/>
+          <w:p>
+            <w:pPr>
+              <w:pStyle w:val="Compact"/>
+              <w:jc w:val="left"/>
+            </w:pPr>
             <w:r>
               <w:rPr>
                 <w:bCs/>
                 <w:b/>
               </w:rPr>
-              <w:t xml:space="preserve">Worth it at $X or less</w:t>
-            </w:r>
-            <w:r>
-              <w:rPr>
-                <w:bCs/>
-                <w:b/>
-              </w:rPr>
-              <w:t xml:space="preserve">”</w:t>
-            </w:r>
-            <w:r>
-              <w:t xml:space="preserve"> </w:t>
-            </w:r>
-            <w:r>
-              <w:t xml:space="preserve">on a MAYBE</w:t>
-            </w:r>
-          </w:p>
-        </w:tc>
-        <w:tc>
-          <w:tcPr/>
-          <w:p>
-            <w:pPr>
-              <w:pStyle w:val="Compact"/>
-              <w:jc w:val="left"/>
-            </w:pPr>
-            <w:r>
-              <w:t xml:space="preserve">Gives a next step at the register</w:t>
-            </w:r>
-          </w:p>
-        </w:tc>
-        <w:tc>
-          <w:tcPr/>
-          <w:p>
-            <w:pPr>
-              <w:pStyle w:val="Compact"/>
-              <w:jc w:val="left"/>
-            </w:pPr>
-            <w:r>
-              <w:t xml:space="preserve">New</w:t>
-            </w:r>
-          </w:p>
-        </w:tc>
-      </w:tr>
-      <w:tr>
-        <w:tc>
-          <w:tcPr/>
-          <w:p>
-            <w:pPr>
-              <w:pStyle w:val="Compact"/>
-              <w:jc w:val="left"/>
-            </w:pPr>
-            <w:r>
-              <w:rPr>
-                <w:bCs/>
-                <w:b/>
-              </w:rPr>
-              <w:t xml:space="preserve">“</w:t>
-            </w:r>
-            <w:r>
-              <w:rPr>
-                <w:bCs/>
-                <w:b/>
-              </w:rPr>
-              <w:t xml:space="preserve">I bought it: list it now</w:t>
-            </w:r>
-            <w:r>
-              <w:rPr>
-                <w:bCs/>
-                <w:b/>
-              </w:rPr>
-              <w:t xml:space="preserve">”</w:t>
+              <w:t xml:space="preserve">"I bought it: list it now"</w:t>
             </w:r>
             <w:r>
               <w:t xml:space="preserve">: photo, price and what you paid filled in</w:t>
@@ -774,19 +656,7 @@
               <w:t xml:space="preserve"> </w:t>
             </w:r>
             <w:r>
-              <w:t xml:space="preserve">“</w:t>
-            </w:r>
-            <w:r>
-              <w:t xml:space="preserve">Paid $4, sells $45, BUY</w:t>
-            </w:r>
-            <w:r>
-              <w:t xml:space="preserve">”</w:t>
-            </w:r>
-            <w:r>
-              <w:t xml:space="preserve"> </w:t>
-            </w:r>
-            <w:r>
-              <w:t xml:space="preserve">with their invite link</w:t>
+              <w:t xml:space="preserve">"Paid $4, sells $45, BUY" with their invite link</w:t>
             </w:r>
           </w:p>
         </w:tc>
@@ -886,21 +756,7 @@
                 <w:bCs/>
                 <w:b/>
               </w:rPr>
-              <w:t xml:space="preserve">“</w:t>
-            </w:r>
-            <w:r>
-              <w:rPr>
-                <w:bCs/>
-                <w:b/>
-              </w:rPr>
-              <w:t xml:space="preserve">Put it on your home screen</w:t>
-            </w:r>
-            <w:r>
-              <w:rPr>
-                <w:bCs/>
-                <w:b/>
-              </w:rPr>
-              <w:t xml:space="preserve">”</w:t>
+              <w:t xml:space="preserve">"Put it on your home screen"</w:t>
             </w:r>
             <w:r>
               <w:t xml:space="preserve"> </w:t>
@@ -954,7 +810,7 @@
               <w:t xml:space="preserve"> </w:t>
             </w:r>
             <w:r>
-              <w:t xml:space="preserve">(opt-in): new color-tag week, plus last week’s finds</w:t>
+              <w:t xml:space="preserve">(opt-in): new color-tag week, plus last week's finds</w:t>
             </w:r>
           </w:p>
         </w:tc>
@@ -1002,13 +858,7 @@
               <w:t xml:space="preserve"> </w:t>
             </w:r>
             <w:r>
-              <w:t xml:space="preserve">“</w:t>
-            </w:r>
-            <w:r>
-              <w:t xml:space="preserve">1,284 finds checked this week</w:t>
-            </w:r>
-            <w:r>
-              <w:t xml:space="preserve">”</w:t>
+              <w:t xml:space="preserve">"1,284 finds checked this week"</w:t>
             </w:r>
           </w:p>
         </w:tc>
@@ -1053,31 +903,19 @@
               <w:t xml:space="preserve">Honest about how sure it is</w:t>
             </w:r>
             <w:r>
-              <w:t xml:space="preserve">, and says when it’s an estimate</w:t>
-            </w:r>
-          </w:p>
-        </w:tc>
-        <w:tc>
-          <w:tcPr/>
-          <w:p>
-            <w:pPr>
-              <w:pStyle w:val="Compact"/>
-              <w:jc w:val="left"/>
-            </w:pPr>
-            <w:r>
-              <w:t xml:space="preserve">“</w:t>
-            </w:r>
-            <w:r>
-              <w:t xml:space="preserve">Wrong value</w:t>
-            </w:r>
-            <w:r>
-              <w:t xml:space="preserve">”</w:t>
-            </w:r>
-            <w:r>
-              <w:t xml:space="preserve"> </w:t>
-            </w:r>
-            <w:r>
-              <w:t xml:space="preserve">is the number one complaint</w:t>
+              <w:t xml:space="preserve">, and says when it's an estimate</w:t>
+            </w:r>
+          </w:p>
+        </w:tc>
+        <w:tc>
+          <w:tcPr/>
+          <w:p>
+            <w:pPr>
+              <w:pStyle w:val="Compact"/>
+              <w:jc w:val="left"/>
+            </w:pPr>
+            <w:r>
+              <w:t xml:space="preserve">"Wrong value" is the number one complaint</w:t>
             </w:r>
           </w:p>
         </w:tc>
@@ -1116,19 +954,7 @@
         <w:t xml:space="preserve"> </w:t>
       </w:r>
       <w:r>
-        <w:t xml:space="preserve">(</w:t>
-      </w:r>
-      <w:r>
-        <w:t xml:space="preserve">“</w:t>
-      </w:r>
-      <w:r>
-        <w:t xml:space="preserve">In the thrift store? Check it before you buy it.</w:t>
-      </w:r>
-      <w:r>
-        <w:t xml:space="preserve">”</w:t>
-      </w:r>
-      <w:r>
-        <w:t xml:space="preserve">) and</w:t>
+        <w:t xml:space="preserve">("In the thrift store? Check it before you buy it.") and</w:t>
       </w:r>
       <w:r>
         <w:t xml:space="preserve"> </w:t>
@@ -1173,25 +999,7 @@
         <w:t xml:space="preserve"> </w:t>
       </w:r>
       <w:r>
-        <w:t xml:space="preserve">Every</w:t>
-      </w:r>
-      <w:r>
-        <w:t xml:space="preserve"> </w:t>
-      </w:r>
-      <w:r>
-        <w:t xml:space="preserve">“</w:t>
-      </w:r>
-      <w:r>
-        <w:t xml:space="preserve">I bought it</w:t>
-      </w:r>
-      <w:r>
-        <w:t xml:space="preserve">”</w:t>
-      </w:r>
-      <w:r>
-        <w:t xml:space="preserve"> </w:t>
-      </w:r>
-      <w:r>
-        <w:t xml:space="preserve">becomes a listing in our store, where we take our cut when it sells. Listing is free. This is how Mercari and Whatnot make money: on sales, not scans.</w:t>
+        <w:t xml:space="preserve">Every "I bought it" becomes a listing in our store, where we take our cut when it sells. Listing is free. This is how Mercari and Whatnot make money: on sales, not scans.</w:t>
       </w:r>
     </w:p>
     <w:p>
@@ -1213,7 +1021,7 @@
         <w:t xml:space="preserve"> </w:t>
       </w:r>
       <w:r>
-        <w:t xml:space="preserve">Unlimited checks, unlimited AI listings for nine sites, and the selling tools. We ask at happy moments only: right after a great BUY, or when today’s free checks run out.</w:t>
+        <w:t xml:space="preserve">Unlimited checks, unlimited AI listings for nine sites, and the selling tools. We ask at happy moments only: right after a great BUY, or when today's free checks run out.</w:t>
       </w:r>
     </w:p>
     <w:p>
@@ -1245,22 +1053,7 @@
         <w:pStyle w:val="Heading1"/>
       </w:pPr>
       <w:r>
-        <w:t xml:space="preserve">Your decision: a cheaper</w:t>
-      </w:r>
-      <w:r>
-        <w:t xml:space="preserve"> </w:t>
-      </w:r>
-      <w:r>
-        <w:t xml:space="preserve">“</w:t>
-      </w:r>
-      <w:r>
-        <w:t xml:space="preserve">Thrift Pro</w:t>
-      </w:r>
-      <w:r>
-        <w:t xml:space="preserve">”</w:t>
-      </w:r>
-      <w:r>
-        <w:t xml:space="preserve">?</w:t>
+        <w:t xml:space="preserve">Your decision: a cheaper "Thrift Pro"?</w:t>
       </w:r>
     </w:p>
     <w:p>
@@ -1296,59 +1089,13 @@
           <w:bCs/>
           <w:b/>
         </w:rPr>
-        <w:t xml:space="preserve">$3.99-a-month</w:t>
-      </w:r>
-      <w:r>
-        <w:rPr>
-          <w:bCs/>
-          <w:b/>
-        </w:rPr>
-        <w:t xml:space="preserve"> </w:t>
-      </w:r>
-      <w:r>
-        <w:rPr>
-          <w:bCs/>
-          <w:b/>
-        </w:rPr>
-        <w:t xml:space="preserve">“</w:t>
-      </w:r>
-      <w:r>
-        <w:rPr>
-          <w:bCs/>
-          <w:b/>
-        </w:rPr>
-        <w:t xml:space="preserve">Thrift Pro</w:t>
-      </w:r>
-      <w:r>
-        <w:rPr>
-          <w:bCs/>
-          <w:b/>
-        </w:rPr>
-        <w:t xml:space="preserve">”</w:t>
-      </w:r>
-      <w:r>
-        <w:t xml:space="preserve"> </w:t>
-      </w:r>
-      <w:r>
-        <w:t xml:space="preserve">that gives unlimited checks only. That’s 60% under the paid apps, and it’s an easy yes. Keep $15 Pro for sellers. Say</w:t>
-      </w:r>
-      <w:r>
-        <w:t xml:space="preserve"> </w:t>
-      </w:r>
-      <w:r>
-        <w:t xml:space="preserve">“</w:t>
-      </w:r>
-      <w:r>
-        <w:t xml:space="preserve">go on Thrift Pro</w:t>
-      </w:r>
-      <w:r>
-        <w:t xml:space="preserve">”</w:t>
-      </w:r>
-      <w:r>
-        <w:t xml:space="preserve"> </w:t>
-      </w:r>
-      <w:r>
-        <w:t xml:space="preserve">and I’ll add it.</w:t>
+        <w:t xml:space="preserve">$3.99-a-month "Thrift Pro"</w:t>
+      </w:r>
+      <w:r>
+        <w:t xml:space="preserve"> </w:t>
+      </w:r>
+      <w:r>
+        <w:t xml:space="preserve">that gives unlimited checks only. That's 60% under the paid apps, and it's an easy yes. Keep $15 Pro for sellers. Say "go on Thrift Pro" and I'll add it.</w:t>
       </w:r>
     </w:p>
     <w:bookmarkEnd w:id="24"/>
@@ -1374,21 +1121,7 @@
           <w:bCs/>
           <w:b/>
         </w:rPr>
-        <w:t xml:space="preserve">“</w:t>
-      </w:r>
-      <w:r>
-        <w:rPr>
-          <w:bCs/>
-          <w:b/>
-        </w:rPr>
-        <w:t xml:space="preserve">Was this right?</w:t>
-      </w:r>
-      <w:r>
-        <w:rPr>
-          <w:bCs/>
-          <w:b/>
-        </w:rPr>
-        <w:t xml:space="preserve">”</w:t>
+        <w:t xml:space="preserve">"Was this right?"</w:t>
       </w:r>
       <w:r>
         <w:t xml:space="preserve"> </w:t>
@@ -1410,60 +1143,13 @@
           <w:bCs/>
           <w:b/>
         </w:rPr>
-        <w:t xml:space="preserve">Monthly</w:t>
-      </w:r>
-      <w:r>
-        <w:rPr>
-          <w:bCs/>
-          <w:b/>
-        </w:rPr>
-        <w:t xml:space="preserve"> </w:t>
-      </w:r>
-      <w:r>
-        <w:rPr>
-          <w:bCs/>
-          <w:b/>
-        </w:rPr>
-        <w:t xml:space="preserve">“</w:t>
-      </w:r>
-      <w:r>
-        <w:rPr>
-          <w:bCs/>
-          <w:b/>
-        </w:rPr>
-        <w:t xml:space="preserve">Flip Wrapped</w:t>
-      </w:r>
-      <w:r>
-        <w:rPr>
-          <w:bCs/>
-          <w:b/>
-        </w:rPr>
-        <w:t xml:space="preserve">”</w:t>
-      </w:r>
-      <w:r>
-        <w:rPr>
-          <w:bCs/>
-          <w:b/>
-        </w:rPr>
-        <w:t xml:space="preserve">:</w:t>
-      </w:r>
-      <w:r>
-        <w:t xml:space="preserve"> </w:t>
-      </w:r>
-      <w:r>
-        <w:t xml:space="preserve">“</w:t>
-      </w:r>
-      <w:r>
-        <w:t xml:space="preserve">You found $412 this month. Best find: a $3 Pyrex bowl.</w:t>
-      </w:r>
-      <w:r>
-        <w:t xml:space="preserve">”</w:t>
-      </w:r>
-      <w:r>
-        <w:t xml:space="preserve"> </w:t>
-      </w:r>
-      <w:r>
-        <w:t xml:space="preserve">People remember the best moment and how things ended.</w:t>
+        <w:t xml:space="preserve">Monthly "Flip Wrapped":</w:t>
+      </w:r>
+      <w:r>
+        <w:t xml:space="preserve"> </w:t>
+      </w:r>
+      <w:r>
+        <w:t xml:space="preserve">"You found $412 this month. Best find: a $3 Pyrex bowl." People remember the best moment and how things ended.</w:t>
       </w:r>
     </w:p>
     <w:p>
@@ -1577,55 +1263,13 @@
           <w:bCs/>
           <w:b/>
         </w:rPr>
-        <w:t xml:space="preserve">Film one 30-second</w:t>
-      </w:r>
-      <w:r>
-        <w:rPr>
-          <w:bCs/>
-          <w:b/>
-        </w:rPr>
-        <w:t xml:space="preserve"> </w:t>
-      </w:r>
-      <w:r>
-        <w:rPr>
-          <w:bCs/>
-          <w:b/>
-        </w:rPr>
-        <w:t xml:space="preserve">“</w:t>
-      </w:r>
-      <w:r>
-        <w:rPr>
-          <w:bCs/>
-          <w:b/>
-        </w:rPr>
-        <w:t xml:space="preserve">Buy or pass?</w:t>
-      </w:r>
-      <w:r>
-        <w:rPr>
-          <w:bCs/>
-          <w:b/>
-        </w:rPr>
-        <w:t xml:space="preserve">”</w:t>
-      </w:r>
-      <w:r>
-        <w:rPr>
-          <w:bCs/>
-          <w:b/>
-        </w:rPr>
-        <w:t xml:space="preserve"> </w:t>
-      </w:r>
-      <w:r>
-        <w:rPr>
-          <w:bCs/>
-          <w:b/>
-        </w:rPr>
-        <w:t xml:space="preserve">video a day at Goodwill.</w:t>
-      </w:r>
-      <w:r>
-        <w:t xml:space="preserve"> </w:t>
-      </w:r>
-      <w:r>
-        <w:t xml:space="preserve">Hold up the tag and show the answer. Ask the store manager first. This is the strongest move we have. It’s on your to-do list.</w:t>
+        <w:t xml:space="preserve">Film one 30-second "Buy or pass?" video a day at Goodwill.</w:t>
+      </w:r>
+      <w:r>
+        <w:t xml:space="preserve"> </w:t>
+      </w:r>
+      <w:r>
+        <w:t xml:space="preserve">Hold up the tag and show the answer. Ask the store manager first. This is the strongest move we have. It's on your to-do list.</w:t>
       </w:r>
     </w:p>
     <w:p>
@@ -1647,25 +1291,7 @@
         <w:t xml:space="preserve"> </w:t>
       </w:r>
       <w:r>
-        <w:t xml:space="preserve">from your own account (r/whatsthisworth, r/ThriftStoreHauls), and say</w:t>
-      </w:r>
-      <w:r>
-        <w:t xml:space="preserve"> </w:t>
-      </w:r>
-      <w:r>
-        <w:t xml:space="preserve">“</w:t>
-      </w:r>
-      <w:r>
-        <w:t xml:space="preserve">I built this</w:t>
-      </w:r>
-      <w:r>
-        <w:t xml:space="preserve">”</w:t>
-      </w:r>
-      <w:r>
-        <w:t xml:space="preserve"> </w:t>
-      </w:r>
-      <w:r>
-        <w:t xml:space="preserve">when you mention it.</w:t>
+        <w:t xml:space="preserve">from your own account (r/whatsthisworth, r/ThriftStoreHauls), and say "I built this" when you mention it.</w:t>
       </w:r>
     </w:p>
     <w:p>
@@ -1684,25 +1310,7 @@
         <w:t xml:space="preserve">Tell me which creators to try</w:t>
       </w:r>
       <w:r>
-        <w:t xml:space="preserve">, and I’ll draft the</w:t>
-      </w:r>
-      <w:r>
-        <w:t xml:space="preserve"> </w:t>
-      </w:r>
-      <w:r>
-        <w:t xml:space="preserve">“</w:t>
-      </w:r>
-      <w:r>
-        <w:t xml:space="preserve">free Pro for life</w:t>
-      </w:r>
-      <w:r>
-        <w:t xml:space="preserve">”</w:t>
-      </w:r>
-      <w:r>
-        <w:t xml:space="preserve"> </w:t>
-      </w:r>
-      <w:r>
-        <w:t xml:space="preserve">messages.</w:t>
+        <w:t xml:space="preserve">, and I'll draft the "free Pro for life" messages.</w:t>
       </w:r>
     </w:p>
     <w:bookmarkEnd w:id="26"/>

</xml_diff>